<commit_message>
feat: inicialización de arquitectura, diagramas de flujo/arquitectura y distribución de equipo
</commit_message>
<xml_diff>
--- a/Resumen_Exposicion_Negocio_y_Datos.docx
+++ b/Resumen_Exposicion_Negocio_y_Datos.docx
@@ -2,7 +2,20 @@
 <file path=word/document.xml><?xml version="1.0" encoding="utf-8"?>
 <w:document xmlns:wpc="http://schemas.microsoft.com/office/word/2010/wordprocessingCanvas" xmlns:cx="http://schemas.microsoft.com/office/drawing/2014/chartex" xmlns:cx1="http://schemas.microsoft.com/office/drawing/2015/9/8/chartex" xmlns:cx2="http://schemas.microsoft.com/office/drawing/2015/10/21/chartex" xmlns:cx3="http://schemas.microsoft.com/office/drawing/2016/5/9/chartex" xmlns:cx4="http://schemas.microsoft.com/office/drawing/2016/5/10/chartex" xmlns:cx5="http://schemas.microsoft.com/office/drawing/2016/5/11/chartex" xmlns:cx6="http://schemas.microsoft.com/office/drawing/2016/5/12/chartex" xmlns:cx7="http://schemas.microsoft.com/office/drawing/2016/5/13/chartex" xmlns:cx8="http://schemas.microsoft.com/office/drawing/2016/5/14/chartex" xmlns:mc="http://schemas.openxmlformats.org/markup-compatibility/2006" xmlns:aink="http://schemas.microsoft.com/office/drawing/2016/ink" xmlns:am3d="http://schemas.microsoft.com/office/drawing/2017/model3d" xmlns:o="urn:schemas-microsoft-com:office:office" xmlns:oel="http://schemas.microsoft.com/office/2019/extlst" xmlns:r="http://schemas.openxmlformats.org/officeDocument/2006/relationships" xmlns:m="http://schemas.openxmlformats.org/officeDocument/2006/math" xmlns:v="urn:schemas-microsoft-com:vml" xmlns:wp14="http://schemas.microsoft.com/office/word/2010/wordprocessingDrawing" xmlns:wp="http://schemas.openxmlformats.org/drawingml/2006/wordprocessingDrawing" xmlns:w10="urn:schemas-microsoft-com:office:word" xmlns:w="http://schemas.openxmlformats.org/wordprocessingml/2006/main" xmlns:w14="http://schemas.microsoft.com/office/word/2010/wordml" xmlns:w15="http://schemas.microsoft.com/office/word/2012/wordml" xmlns:w16cex="http://schemas.microsoft.com/office/word/2018/wordml/cex" xmlns:w16cid="http://schemas.microsoft.com/office/word/2016/wordml/cid" xmlns:w16="http://schemas.microsoft.com/office/word/2018/wordml" xmlns:w16du="http://schemas.microsoft.com/office/word/2023/wordml/word16du" xmlns:w16sdtdh="http://schemas.microsoft.com/office/word/2020/wordml/sdtdatahash" xmlns:w16sdtfl="http://schemas.microsoft.com/office/word/2024/wordml/sdtformatlock" xmlns:w16se="http://schemas.microsoft.com/office/word/2015/wordml/symex" xmlns:wpg="http://schemas.microsoft.com/office/word/2010/wordprocessingGroup" xmlns:wpi="http://schemas.microsoft.com/office/word/2010/wordprocessingInk" xmlns:wne="http://schemas.microsoft.com/office/word/2006/wordml" xmlns:wps="http://schemas.microsoft.com/office/word/2010/wordprocessingShape" mc:Ignorable="w14 w15 w16se w16cid w16 w16cex w16sdtdh w16sdtfl w16du wp14">
   <w:body>
-    <w:p/>
+    <w:p>
+      <w:pPr>
+        <w:jc w:val="right"/>
+      </w:pPr>
+      <w:r>
+        <w:rPr>
+          <w:rFonts w:ascii="Calibri" w:hAnsi="Calibri"/>
+          <w:b/>
+          <w:color w:val="7F8C8D"/>
+          <w:sz w:val="17"/>
+        </w:rPr>
+        <w:t>MINERÍA DE DATOS (IEI-067) | SANTO TOMÁS — RESUMEN EJECUTIVO PARA EXPOSICIÓN</w:t>
+      </w:r>
+    </w:p>
     <w:p>
       <w:pPr>
         <w:spacing w:after="40"/>
@@ -25,7 +38,7 @@
           <w:color w:val="1E824C"/>
           <w:sz w:val="23"/>
         </w:rPr>
-        <w:t xml:space="preserve">Fases 1 y 2 de CRISP-DM: Comprensión del Negocio y de los Datos </w:t>
+        <w:t>Fases 1 y 2 de CRISP-DM: Comprensión del Negocio y de los Datos (Puntos Clave)</w:t>
       </w:r>
     </w:p>
     <w:tbl>
@@ -172,7 +185,7 @@
           <w:color w:val="184C78"/>
           <w:sz w:val="26"/>
         </w:rPr>
-        <w:t xml:space="preserve">PUNTO 1: COMPRENSIÓN DEL NEGOCIO </w:t>
+        <w:t>PUNTO 1: COMPRENSIÓN DEL NEGOCIO (¿Por qué y para qué?)</w:t>
       </w:r>
     </w:p>
     <w:p>
@@ -186,7 +199,7 @@
           <w:color w:val="1E824C"/>
           <w:sz w:val="21"/>
         </w:rPr>
-        <w:t xml:space="preserve">1.1 El Problema Real </w:t>
+        <w:t>1.1 El Problema Real (El Pitch de Negocio)</w:t>
       </w:r>
     </w:p>
     <w:p>
@@ -246,7 +259,7 @@
           <w:color w:val="1E824C"/>
           <w:sz w:val="21"/>
         </w:rPr>
-        <w:t xml:space="preserve">1.2 Lo que Resuelve la Minería de Datos </w:t>
+        <w:t>1.2 Lo que Resuelve la Minería de Datos (Las 3 Técnicas + Web)</w:t>
       </w:r>
     </w:p>
     <w:p>
@@ -352,7 +365,7 @@
           <w:color w:val="1E824C"/>
           <w:sz w:val="21"/>
         </w:rPr>
-        <w:t xml:space="preserve">1.3 Metas de Éxito Concretas </w:t>
+        <w:t>1.3 Metas de Éxito Concretas (Lo que evalúa el profesor)</w:t>
       </w:r>
     </w:p>
     <w:p>
@@ -435,7 +448,7 @@
           <w:color w:val="184C78"/>
           <w:sz w:val="26"/>
         </w:rPr>
-        <w:t xml:space="preserve">PUNTO 2: COMPRENSIÓN DE LOS DATOS </w:t>
+        <w:t>PUNTO 2: COMPRENSIÓN DE LOS DATOS (¿Con qué trabajamos?)</w:t>
       </w:r>
     </w:p>
     <w:p>
@@ -532,7 +545,7 @@
           <w:color w:val="1E824C"/>
           <w:sz w:val="21"/>
         </w:rPr>
-        <w:t xml:space="preserve">2.2 Identificación de Variables </w:t>
+        <w:t>2.2 Identificación de Variables (Rúbrica de Evaluación)</w:t>
       </w:r>
     </w:p>
     <w:p>
@@ -592,7 +605,7 @@
           <w:color w:val="1E824C"/>
           <w:sz w:val="21"/>
         </w:rPr>
-        <w:t xml:space="preserve">2.3 Datos Estadísticos </w:t>
+        <w:t>2.3 Datos Estadísticos Clave para Decir en la Exposición</w:t>
       </w:r>
     </w:p>
     <w:tbl>

</xml_diff>